<commit_message>
Corrige acentuacao no Word processo_abertura_chamados_sei
</commit_message>
<xml_diff>
--- a/documentações/Processos/docx/processo_abertura_chamados_sei.docx
+++ b/documentações/Processos/docx/processo_abertura_chamados_sei.docx
@@ -41,7 +41,7 @@
           <w:color w:val="5E6B78"/>
           <w:sz w:val="19"/>
         </w:rPr>
-        <w:t>Ãrea responsÃ¡vel e versÃ£o conforme documentaÃ§Ã£o institucional</w:t>
+        <w:t>Área responsável e versão conforme documentação institucional</w:t>
       </w:r>
     </w:p>
     <w:p>
@@ -430,40 +430,7 @@
         <w:keepNext/>
         <w:jc w:val="center"/>
       </w:pPr>
-      <w:r>
-        <w:drawing>
-          <wp:inline xmlns:a="http://schemas.openxmlformats.org/drawingml/2006/main" xmlns:pic="http://schemas.openxmlformats.org/drawingml/2006/picture">
-            <wp:extent cx="5623560" cy="3664726"/>
-            <wp:docPr id="1" name="Picture 1"/>
-            <wp:cNvGraphicFramePr>
-              <a:graphicFrameLocks noChangeAspect="1"/>
-            </wp:cNvGraphicFramePr>
-            <a:graphic>
-              <a:graphicData uri="http://schemas.openxmlformats.org/drawingml/2006/picture">
-                <pic:pic>
-                  <pic:nvPicPr>
-                    <pic:cNvPr id="0" name="processo_abertura_chamados_sei_1.jpg"/>
-                    <pic:cNvPicPr/>
-                  </pic:nvPicPr>
-                  <pic:blipFill>
-                    <a:blip r:embed="rId11"/>
-                    <a:stretch>
-                      <a:fillRect/>
-                    </a:stretch>
-                  </pic:blipFill>
-                  <pic:spPr>
-                    <a:xfrm>
-                      <a:off x="0" y="0"/>
-                      <a:ext cx="5623560" cy="3664726"/>
-                    </a:xfrm>
-                    <a:prstGeom prst="rect"/>
-                  </pic:spPr>
-                </pic:pic>
-              </a:graphicData>
-            </a:graphic>
-          </wp:inline>
-        </w:drawing>
-      </w:r>
+      <w:r/>
     </w:p>
     <w:p>
       <w:pPr>
@@ -2211,40 +2178,7 @@
         <w:keepNext/>
         <w:jc w:val="center"/>
       </w:pPr>
-      <w:r>
-        <w:drawing>
-          <wp:inline xmlns:a="http://schemas.openxmlformats.org/drawingml/2006/main" xmlns:pic="http://schemas.openxmlformats.org/drawingml/2006/picture">
-            <wp:extent cx="5623560" cy="2438352"/>
-            <wp:docPr id="2" name="Picture 2"/>
-            <wp:cNvGraphicFramePr>
-              <a:graphicFrameLocks noChangeAspect="1"/>
-            </wp:cNvGraphicFramePr>
-            <a:graphic>
-              <a:graphicData uri="http://schemas.openxmlformats.org/drawingml/2006/picture">
-                <pic:pic>
-                  <pic:nvPicPr>
-                    <pic:cNvPr id="0" name="processo_abertura_chamados_sei_2.png"/>
-                    <pic:cNvPicPr/>
-                  </pic:nvPicPr>
-                  <pic:blipFill>
-                    <a:blip r:embed="rId12"/>
-                    <a:stretch>
-                      <a:fillRect/>
-                    </a:stretch>
-                  </pic:blipFill>
-                  <pic:spPr>
-                    <a:xfrm>
-                      <a:off x="0" y="0"/>
-                      <a:ext cx="5623560" cy="2438352"/>
-                    </a:xfrm>
-                    <a:prstGeom prst="rect"/>
-                  </pic:spPr>
-                </pic:pic>
-              </a:graphicData>
-            </a:graphic>
-          </wp:inline>
-        </w:drawing>
-      </w:r>
+      <w:r/>
     </w:p>
     <w:p>
       <w:pPr>
@@ -2271,40 +2205,7 @@
         <w:keepNext/>
         <w:jc w:val="center"/>
       </w:pPr>
-      <w:r>
-        <w:drawing>
-          <wp:inline xmlns:a="http://schemas.openxmlformats.org/drawingml/2006/main" xmlns:pic="http://schemas.openxmlformats.org/drawingml/2006/picture">
-            <wp:extent cx="5623560" cy="2299896"/>
-            <wp:docPr id="3" name="Picture 3"/>
-            <wp:cNvGraphicFramePr>
-              <a:graphicFrameLocks noChangeAspect="1"/>
-            </wp:cNvGraphicFramePr>
-            <a:graphic>
-              <a:graphicData uri="http://schemas.openxmlformats.org/drawingml/2006/picture">
-                <pic:pic>
-                  <pic:nvPicPr>
-                    <pic:cNvPr id="0" name="processo_abertura_chamados_sei_3.png"/>
-                    <pic:cNvPicPr/>
-                  </pic:nvPicPr>
-                  <pic:blipFill>
-                    <a:blip r:embed="rId13"/>
-                    <a:stretch>
-                      <a:fillRect/>
-                    </a:stretch>
-                  </pic:blipFill>
-                  <pic:spPr>
-                    <a:xfrm>
-                      <a:off x="0" y="0"/>
-                      <a:ext cx="5623560" cy="2299896"/>
-                    </a:xfrm>
-                    <a:prstGeom prst="rect"/>
-                  </pic:spPr>
-                </pic:pic>
-              </a:graphicData>
-            </a:graphic>
-          </wp:inline>
-        </w:drawing>
-      </w:r>
+      <w:r/>
     </w:p>
     <w:p>
       <w:pPr>
@@ -2331,40 +2232,7 @@
         <w:keepNext/>
         <w:jc w:val="center"/>
       </w:pPr>
-      <w:r>
-        <w:drawing>
-          <wp:inline xmlns:a="http://schemas.openxmlformats.org/drawingml/2006/main" xmlns:pic="http://schemas.openxmlformats.org/drawingml/2006/picture">
-            <wp:extent cx="5623560" cy="1996986"/>
-            <wp:docPr id="4" name="Picture 4"/>
-            <wp:cNvGraphicFramePr>
-              <a:graphicFrameLocks noChangeAspect="1"/>
-            </wp:cNvGraphicFramePr>
-            <a:graphic>
-              <a:graphicData uri="http://schemas.openxmlformats.org/drawingml/2006/picture">
-                <pic:pic>
-                  <pic:nvPicPr>
-                    <pic:cNvPr id="0" name="processo_abertura_chamados_sei_4.png"/>
-                    <pic:cNvPicPr/>
-                  </pic:nvPicPr>
-                  <pic:blipFill>
-                    <a:blip r:embed="rId14"/>
-                    <a:stretch>
-                      <a:fillRect/>
-                    </a:stretch>
-                  </pic:blipFill>
-                  <pic:spPr>
-                    <a:xfrm>
-                      <a:off x="0" y="0"/>
-                      <a:ext cx="5623560" cy="1996986"/>
-                    </a:xfrm>
-                    <a:prstGeom prst="rect"/>
-                  </pic:spPr>
-                </pic:pic>
-              </a:graphicData>
-            </a:graphic>
-          </wp:inline>
-        </w:drawing>
-      </w:r>
+      <w:r/>
     </w:p>
     <w:p>
       <w:pPr>
@@ -4524,6 +4392,8 @@
     <w:sectPr>
       <w:headerReference w:type="default" r:id="rId9"/>
       <w:footerReference w:type="default" r:id="rId10"/>
+      <w:headerReference w:type="first" r:id="rId15"/>
+      <w:footerReference w:type="first" r:id="rId16"/>
       <w:pgSz w:w="12240" w:h="15840"/>
       <w:pgMar w:top="1080" w:right="1123" w:bottom="1080" w:left="1123" w:header="504" w:footer="504" w:gutter="0"/>
       <w:cols w:space="720"/>
@@ -4546,7 +4416,7 @@
         <w:color w:val="5E6B78"/>
         <w:sz w:val="17"/>
       </w:rPr>
-      <w:t xml:space="preserve">Secretaria de SaÃºde do Recife  |  </w:t>
+      <w:t xml:space="preserve">Secretaria de Saúde do Recife  |  </w:t>
     </w:r>
     <w:r>
       <w:rPr>
@@ -4554,9 +4424,19 @@
         <w:color w:val="5E6B78"/>
         <w:sz w:val="18"/>
       </w:rPr>
-      <w:t xml:space="preserve">PÃ¡gina </w:t>
+      <w:t xml:space="preserve">Página </w:t>
     </w:r>
     <w:fldSimple w:instr="PAGE"/>
+  </w:p>
+</w:ftr>
+</file>
+
+<file path=word/footer2.xml><?xml version="1.0" encoding="utf-8"?>
+<w:ftr xmlns:m="http://schemas.openxmlformats.org/officeDocument/2006/math" xmlns:mc="http://schemas.openxmlformats.org/markup-compatibility/2006" xmlns:mo="http://schemas.microsoft.com/office/mac/office/2008/main" xmlns:mv="urn:schemas-microsoft-com:mac:vml" xmlns:o="urn:schemas-microsoft-com:office:office" xmlns:r="http://schemas.openxmlformats.org/officeDocument/2006/relationships" xmlns:v="urn:schemas-microsoft-com:vml" xmlns:w10="urn:schemas-microsoft-com:office:word" xmlns:w14="http://schemas.microsoft.com/office/word/2010/wordml" xmlns:w="http://schemas.openxmlformats.org/wordprocessingml/2006/main" xmlns:wne="http://schemas.microsoft.com/office/word/2006/wordml" xmlns:wp14="http://schemas.microsoft.com/office/word/2010/wordprocessingDrawing" xmlns:wp="http://schemas.openxmlformats.org/drawingml/2006/wordprocessingDrawing" xmlns:wpc="http://schemas.microsoft.com/office/word/2010/wordprocessingCanvas" xmlns:wpg="http://schemas.microsoft.com/office/word/2010/wordprocessingGroup" xmlns:wpi="http://schemas.microsoft.com/office/word/2010/wordprocessingInk" xmlns:wps="http://schemas.microsoft.com/office/word/2010/wordprocessingShape" mc:Ignorable="w14 wp14">
+  <w:p>
+    <w:pPr>
+      <w:pStyle w:val="Footer"/>
+    </w:pPr>
   </w:p>
 </w:ftr>
 </file>
@@ -4575,8 +4455,18 @@
         <w:color w:val="5E6B78"/>
         <w:sz w:val="17"/>
       </w:rPr>
-      <w:t>SAÃšDE DIGITAL ATENDE  |  PROCESSO OPERACIONAL</w:t>
+      <w:t>SAÚDE DIGITAL ATENDE  |  PROCESSO OPERACIONAL</w:t>
     </w:r>
+  </w:p>
+</w:hdr>
+</file>
+
+<file path=word/header2.xml><?xml version="1.0" encoding="utf-8"?>
+<w:hdr xmlns:m="http://schemas.openxmlformats.org/officeDocument/2006/math" xmlns:mc="http://schemas.openxmlformats.org/markup-compatibility/2006" xmlns:mo="http://schemas.microsoft.com/office/mac/office/2008/main" xmlns:mv="urn:schemas-microsoft-com:mac:vml" xmlns:o="urn:schemas-microsoft-com:office:office" xmlns:r="http://schemas.openxmlformats.org/officeDocument/2006/relationships" xmlns:v="urn:schemas-microsoft-com:vml" xmlns:w10="urn:schemas-microsoft-com:office:word" xmlns:w14="http://schemas.microsoft.com/office/word/2010/wordml" xmlns:w="http://schemas.openxmlformats.org/wordprocessingml/2006/main" xmlns:wne="http://schemas.microsoft.com/office/word/2006/wordml" xmlns:wp14="http://schemas.microsoft.com/office/word/2010/wordprocessingDrawing" xmlns:wp="http://schemas.openxmlformats.org/drawingml/2006/wordprocessingDrawing" xmlns:wpc="http://schemas.microsoft.com/office/word/2010/wordprocessingCanvas" xmlns:wpg="http://schemas.microsoft.com/office/word/2010/wordprocessingGroup" xmlns:wpi="http://schemas.microsoft.com/office/word/2010/wordprocessingInk" xmlns:wps="http://schemas.microsoft.com/office/word/2010/wordprocessingShape" mc:Ignorable="w14 wp14">
+  <w:p>
+    <w:pPr>
+      <w:pStyle w:val="Header"/>
+    </w:pPr>
   </w:p>
 </w:hdr>
 </file>

</xml_diff>

<commit_message>
Atualiza Word padronizado processo_abertura_chamados_sei
</commit_message>
<xml_diff>
--- a/documentações/Processos/docx/processo_abertura_chamados_sei.docx
+++ b/documentações/Processos/docx/processo_abertura_chamados_sei.docx
@@ -408,78 +408,7 @@
         <w:pStyle w:val="Heading1"/>
       </w:pPr>
       <w:r>
-        <w:t>Template do SEI</w:t>
-      </w:r>
-    </w:p>
-    <w:p>
-      <w:r>
-        <w:t xml:space="preserve">O próprio template de descrição utilizado no SEI já traz as duas regras que devem ser seguidas ao preencher o campo </w:t>
-      </w:r>
-      <w:r>
-        <w:rPr>
-          <w:b/>
-        </w:rPr>
-        <w:t>E-MAIL</w:t>
-      </w:r>
-      <w:r>
-        <w:t>.</w:t>
-      </w:r>
-    </w:p>
-    <w:p>
-      <w:pPr>
-        <w:keepNext/>
-        <w:jc w:val="center"/>
-      </w:pPr>
-      <w:r/>
-    </w:p>
-    <w:p>
-      <w:pPr>
-        <w:spacing w:after="160"/>
-        <w:jc w:val="center"/>
-      </w:pPr>
-      <w:r>
-        <w:rPr>
-          <w:rFonts w:ascii="Arial" w:hAnsi="Arial"/>
-          <w:i/>
-          <w:color w:val="5E6B78"/>
-          <w:sz w:val="17"/>
-        </w:rPr>
-        <w:t>Template de descrição do SEI com os campos e as observações sobre o preenchimento do E-MAIL</w:t>
-      </w:r>
-    </w:p>
-    <w:p>
-      <w:r>
-        <w:t>Figura 1 – Template de descrição do SEI, com os campos e as observações de preenchimento do E-MAIL.</w:t>
-      </w:r>
-    </w:p>
-    <w:p>
-      <w:pPr>
-        <w:spacing w:after="80"/>
-      </w:pPr>
-      <w:r>
-        <w:rPr>
-          <w:color w:val="163A63"/>
-        </w:rPr>
-        <w:t>Atenção (do próprio template): O nome do campo deve permanecer como E-MAIL (em letras maiúsculas). Não altere para "e-mail" ou "Email".</w:t>
-      </w:r>
-    </w:p>
-    <w:p>
-      <w:pPr>
-        <w:spacing w:after="80"/>
-      </w:pPr>
-      <w:r>
-        <w:rPr>
-          <w:color w:val="163A63"/>
-        </w:rPr>
-        <w:t>Atenção (do próprio template): Em solicitações para vários e-mails, preencha o campo E-MAIL com o e-mail do autor do chamado. Os demais e-mails devem ser informados na DESCRIÇÃO . Se necessário, localize o e-mail do autor no SEI.</w:t>
-      </w:r>
-    </w:p>
-    <w:p>
-      <w:pPr>
-        <w:pStyle w:val="Heading1"/>
-      </w:pPr>
-      <w:r>
-        <w:t>Fluxo resumido Visão rápida</w:t>
+        <w:t>Fluxo resumido</w:t>
       </w:r>
     </w:p>
     <w:p>
@@ -519,7 +448,7 @@
         <w:pStyle w:val="Heading1"/>
       </w:pPr>
       <w:r>
-        <w:t>Processo 1 Abertura do chamado com o e-mail correto</w:t>
+        <w:t>Processo 1 - Abertura do chamado com o e-mail correto</w:t>
       </w:r>
     </w:p>
     <w:tbl>
@@ -1259,7 +1188,7 @@
         <w:pStyle w:val="Heading1"/>
       </w:pPr>
       <w:r>
-        <w:t>Processo 2 Abertura de chamado para usuário externo</w:t>
+        <w:t>Processo 2 - Abertura de chamado para usuário externo</w:t>
       </w:r>
     </w:p>
     <w:p>
@@ -2281,7 +2210,7 @@
         <w:pStyle w:val="Heading1"/>
       </w:pPr>
       <w:r>
-        <w:t>Processo 3 Cadastro de Usuário SEI</w:t>
+        <w:t>Processo 3 - Cadastro de Usuário SEI</w:t>
       </w:r>
     </w:p>
     <w:p>
@@ -3328,6 +3257,77 @@
         <w:pStyle w:val="Heading1"/>
       </w:pPr>
       <w:r>
+        <w:t>Template do SEI</w:t>
+      </w:r>
+    </w:p>
+    <w:p>
+      <w:r>
+        <w:t xml:space="preserve">O próprio template de descrição utilizado no SEI já traz as duas regras que devem ser seguidas ao preencher o campo </w:t>
+      </w:r>
+      <w:r>
+        <w:rPr>
+          <w:b/>
+        </w:rPr>
+        <w:t>E-MAIL</w:t>
+      </w:r>
+      <w:r>
+        <w:t>.</w:t>
+      </w:r>
+    </w:p>
+    <w:p>
+      <w:pPr>
+        <w:keepNext/>
+        <w:jc w:val="center"/>
+      </w:pPr>
+      <w:r/>
+    </w:p>
+    <w:p>
+      <w:pPr>
+        <w:spacing w:after="160"/>
+        <w:jc w:val="center"/>
+      </w:pPr>
+      <w:r>
+        <w:rPr>
+          <w:rFonts w:ascii="Arial" w:hAnsi="Arial"/>
+          <w:i/>
+          <w:color w:val="5E6B78"/>
+          <w:sz w:val="17"/>
+        </w:rPr>
+        <w:t>Template de descrição do SEI com os campos e as observações sobre o preenchimento do E-MAIL</w:t>
+      </w:r>
+    </w:p>
+    <w:p>
+      <w:r>
+        <w:t>Figura 1 – Template de descrição do SEI, com os campos e as observações de preenchimento do E-MAIL.</w:t>
+      </w:r>
+    </w:p>
+    <w:p>
+      <w:pPr>
+        <w:spacing w:after="80"/>
+      </w:pPr>
+      <w:r>
+        <w:rPr>
+          <w:color w:val="163A63"/>
+        </w:rPr>
+        <w:t>Atenção (do próprio template): O nome do campo deve permanecer como E-MAIL (em letras maiúsculas). Não altere para "e-mail" ou "Email".</w:t>
+      </w:r>
+    </w:p>
+    <w:p>
+      <w:pPr>
+        <w:spacing w:after="80"/>
+      </w:pPr>
+      <w:r>
+        <w:rPr>
+          <w:color w:val="163A63"/>
+        </w:rPr>
+        <w:t>Atenção (do próprio template): Em solicitações para vários e-mails, preencha o campo E-MAIL com o e-mail do autor do chamado. Os demais e-mails devem ser informados na DESCRIÇÃO . Se necessário, localize o e-mail do autor no SEI.</w:t>
+      </w:r>
+    </w:p>
+    <w:p>
+      <w:pPr>
+        <w:pStyle w:val="Heading1"/>
+      </w:pPr>
+      <w:r>
         <w:t>Pontos de Atenção</w:t>
       </w:r>
     </w:p>
@@ -3469,7 +3469,7 @@
         <w:pStyle w:val="Heading1"/>
       </w:pPr>
       <w:r>
-        <w:t>Histórico de Revisões</w:t>
+        <w:t>Histórico de Revisão</w:t>
       </w:r>
     </w:p>
     <w:tbl>

</xml_diff>